<commit_message>
docs: add direct Vercel CLI deployment without Git to guide and Word manual
</commit_message>
<xml_diff>
--- a/HUONG_DAN_CAI_DAT_VA_TRIEN_KHAI_BAKERY_ERP.docx
+++ b/HUONG_DAN_CAI_DAT_VA_TRIEN_KHAI_BAKERY_ERP.docx
@@ -146,7 +146,7 @@
           <w:color w:val="323232"/>
           <w:sz w:val="20"/>
         </w:rPr>
-        <w:t>3. PHẦN 2: Hướng Dẫn Cấu Hình Môi Trường &amp; Triển Khai Lên Vercel</w:t>
+        <w:t>3. PHẦN 2: Hướng Dẫn Đẩy Mã Nguồn Lên GitHub &amp; Xác Thực Token</w:t>
       </w:r>
     </w:p>
     <w:p>
@@ -160,7 +160,7 @@
           <w:color w:val="323232"/>
           <w:sz w:val="20"/>
         </w:rPr>
-        <w:t xml:space="preserve">   - Bước 2.1: Đồng bộ mã nguồn lên GitHub</w:t>
+        <w:t xml:space="preserve">   - Bước 2.1: Cách đẩy cập nhật code hàng ngày (Dự án hiện tại)</w:t>
       </w:r>
     </w:p>
     <w:p>
@@ -174,7 +174,7 @@
           <w:color w:val="323232"/>
           <w:sz w:val="20"/>
         </w:rPr>
-        <w:t xml:space="preserve">   - Bước 2.2: Import dự án vào Vercel</w:t>
+        <w:t xml:space="preserve">   - Bước 2.2: Cách đẩy một dự án mới tinh từ con số 0</w:t>
       </w:r>
     </w:p>
     <w:p>
@@ -188,7 +188,7 @@
           <w:color w:val="323232"/>
           <w:sz w:val="20"/>
         </w:rPr>
-        <w:t xml:space="preserve">   - Bước 2.3: Thiết lập các Biến Môi Trường (Environment Variables)</w:t>
+        <w:t xml:space="preserve">   - Bước 2.3: Cách lấy Personal Access Token khi GitHub đòi mật khẩu</w:t>
       </w:r>
     </w:p>
     <w:p>
@@ -202,7 +202,7 @@
           <w:color w:val="323232"/>
           <w:sz w:val="20"/>
         </w:rPr>
-        <w:t xml:space="preserve">   - Bước 2.4: Biên dịch và Xuất bản website</w:t>
+        <w:t xml:space="preserve">   - Bước 2.4: Dùng công cụ trực quan GitHub Desktop</w:t>
       </w:r>
     </w:p>
     <w:p>
@@ -216,7 +216,7 @@
           <w:color w:val="323232"/>
           <w:sz w:val="20"/>
         </w:rPr>
-        <w:t>4. PHẦN 3: Danh Sách Tài Khoản Đăng Nhập &amp; Quy Trình Nghiệm Thu</w:t>
+        <w:t>4. PHẦN 3: Hướng Dẫn Cấu Hình Môi Trường &amp; Triển Khai Lên Vercel</w:t>
       </w:r>
     </w:p>
     <w:p>
@@ -230,7 +230,77 @@
           <w:color w:val="323232"/>
           <w:sz w:val="20"/>
         </w:rPr>
-        <w:t>5. PHẦN 4: Hướng Dẫn Vận Hành, Sao Lưu Dự Phòng &amp; Xử Lý Sự Cố</w:t>
+        <w:t xml:space="preserve">   - CÁCH 1: Triển khai trực tiếp bằng Vercel CLI (Không cần qua Git)</w:t>
+      </w:r>
+    </w:p>
+    <w:p>
+      <w:pPr>
+        <w:spacing w:before="20" w:after="20"/>
+        <w:ind w:left="288"/>
+      </w:pPr>
+      <w:r>
+        <w:rPr>
+          <w:rFonts w:ascii="Segoe UI" w:hAnsi="Segoe UI"/>
+          <w:color w:val="323232"/>
+          <w:sz w:val="20"/>
+        </w:rPr>
+        <w:t xml:space="preserve">   - CÁCH 2: Kết nối qua GitHub Repository (Tự động đồng bộ CI/CD)</w:t>
+      </w:r>
+    </w:p>
+    <w:p>
+      <w:pPr>
+        <w:spacing w:before="20" w:after="20"/>
+        <w:ind w:left="288"/>
+      </w:pPr>
+      <w:r>
+        <w:rPr>
+          <w:rFonts w:ascii="Segoe UI" w:hAnsi="Segoe UI"/>
+          <w:color w:val="323232"/>
+          <w:sz w:val="20"/>
+        </w:rPr>
+        <w:t xml:space="preserve">   - Bước 3.2: Thiết lập các Biến Môi Trường (Environment Variables)</w:t>
+      </w:r>
+    </w:p>
+    <w:p>
+      <w:pPr>
+        <w:spacing w:before="20" w:after="20"/>
+        <w:ind w:left="288"/>
+      </w:pPr>
+      <w:r>
+        <w:rPr>
+          <w:rFonts w:ascii="Segoe UI" w:hAnsi="Segoe UI"/>
+          <w:color w:val="323232"/>
+          <w:sz w:val="20"/>
+        </w:rPr>
+        <w:t xml:space="preserve">   - Bước 3.3: Biên dịch và Xuất bản website</w:t>
+      </w:r>
+    </w:p>
+    <w:p>
+      <w:pPr>
+        <w:spacing w:before="20" w:after="20"/>
+        <w:ind w:left="288"/>
+      </w:pPr>
+      <w:r>
+        <w:rPr>
+          <w:rFonts w:ascii="Segoe UI" w:hAnsi="Segoe UI"/>
+          <w:color w:val="323232"/>
+          <w:sz w:val="20"/>
+        </w:rPr>
+        <w:t>5. PHẦN 4: Danh Sách Tài Khoản Đăng Nhập &amp; Quy Trình Nghiệm Thu</w:t>
+      </w:r>
+    </w:p>
+    <w:p>
+      <w:pPr>
+        <w:spacing w:before="20" w:after="20"/>
+        <w:ind w:left="288"/>
+      </w:pPr>
+      <w:r>
+        <w:rPr>
+          <w:rFonts w:ascii="Segoe UI" w:hAnsi="Segoe UI"/>
+          <w:color w:val="323232"/>
+          <w:sz w:val="20"/>
+        </w:rPr>
+        <w:t>6. PHẦN 5: Hướng Dẫn Vận Hành, Sao Lưu Dự Phòng &amp; Xử Lý Sự Cố</w:t>
       </w:r>
     </w:p>
     <w:p/>
@@ -569,7 +639,7 @@
           <w:color w:val="B45309"/>
           <w:sz w:val="26"/>
         </w:rPr>
-        <w:t>3. PHẦN 2: HƯỚNG DẪN TRIỂN KHAI ỨNG DỤNG LÊN VERCEL</w:t>
+        <w:t>3. PHẦN 2: HƯỚNG DẪN ĐẨY MÃ NGUỒN LÊN GITHUB &amp; CẤU HÌNH TOKEN</w:t>
       </w:r>
     </w:p>
     <w:p>
@@ -579,20 +649,332 @@
           <w:color w:val="1E3A8A"/>
           <w:sz w:val="22"/>
         </w:rPr>
-        <w:t>Bước 2.1 &amp; 2.2: Đồng Bộ Lên GitHub &amp; Import Vào Vercel</w:t>
+        <w:t>Bước 2.1: Cách Đẩy Cập Nhật Hàng Ngày (Cho Dự Án Hiện Tại)</w:t>
         <w:br/>
       </w:r>
       <w:r>
         <w:rPr>
           <w:sz w:val="20"/>
         </w:rPr>
-        <w:t>1. Đảm bảo toàn bộ mã nguồn đã được commit và push lên branch main của GitHub:</w:t>
+        <w:t>Dự án Bakery ERP hiện tại đã liên kết với repository: https://github.com/buiquyvietgl4/bakery-pos.git (nhánh main).</w:t>
         <w:br/>
-        <w:t xml:space="preserve">   Repository: https://github.com/buiquyvietgl4/bakery-pos.git</w:t>
+        <w:t>Mỗi khi bạn sửa đổi code và muốn đẩy lên để Vercel tự động cập nhật, chạy 3 lệnh sau:</w:t>
         <w:br/>
-        <w:t>2. Truy cập https://vercel.com và đăng nhập bằng tài khoản GitHub.</w:t>
         <w:br/>
-        <w:t>3. Bấm 'Add New...' -&gt; chọn 'Project' -&gt; tìm repository 'bakery-pos' và bấm 'Import'.</w:t>
+        <w:t xml:space="preserve">   git add .</w:t>
+        <w:br/>
+        <w:t xml:space="preserve">   git commit -m "cập nhật tính năng mới"</w:t>
+        <w:br/>
+        <w:t xml:space="preserve">   git push origin main</w:t>
+        <w:br/>
+      </w:r>
+    </w:p>
+    <w:p>
+      <w:pPr>
+        <w:spacing w:before="120"/>
+      </w:pPr>
+      <w:r>
+        <w:rPr>
+          <w:b/>
+          <w:color w:val="1E3A8A"/>
+          <w:sz w:val="22"/>
+        </w:rPr>
+        <w:t>Bước 2.2: Cách Đẩy Một Dự Án Mới Tinh Từ Con Số 0</w:t>
+        <w:br/>
+      </w:r>
+      <w:r>
+        <w:rPr>
+          <w:sz w:val="20"/>
+        </w:rPr>
+        <w:t>1. Tạo repository trống trên GitHub: Vào https://github.com -&gt; Bấm dấu '+' -&gt; New repository -&gt; Đặt tên repo.</w:t>
+        <w:br/>
+        <w:t xml:space="preserve">   ⚠️ Lưu ý: KHÔNG tích chọn Add README, .gitignore hoặc License (để repo hoàn toàn trống).</w:t>
+        <w:br/>
+        <w:t>2. Copy đường link HTTPS (dạng https://github.com/buiquyvietgl4/my-new-project.git).</w:t>
+        <w:br/>
+        <w:t>3. Chạy chuỗi lệnh sau tại thư mục máy tính:</w:t>
+        <w:br/>
+        <w:br/>
+        <w:t xml:space="preserve">   git init</w:t>
+        <w:br/>
+        <w:t xml:space="preserve">   git add .</w:t>
+        <w:br/>
+        <w:t xml:space="preserve">   git commit -m "Initial commit"</w:t>
+        <w:br/>
+        <w:t xml:space="preserve">   git branch -M main</w:t>
+        <w:br/>
+        <w:t xml:space="preserve">   git remote add origin &lt;link_https_vừa_copy&gt;</w:t>
+        <w:br/>
+        <w:t xml:space="preserve">   git push -u origin main</w:t>
+        <w:br/>
+      </w:r>
+    </w:p>
+    <w:p>
+      <w:pPr>
+        <w:spacing w:before="120"/>
+      </w:pPr>
+      <w:r>
+        <w:rPr>
+          <w:b/>
+          <w:color w:val="1E3A8A"/>
+          <w:sz w:val="22"/>
+        </w:rPr>
+        <w:t>Bước 2.3: Cách Tạo Personal Access Token (Khi GitHub Đòi Mật Khẩu)</w:t>
+        <w:br/>
+      </w:r>
+      <w:r>
+        <w:rPr>
+          <w:sz w:val="20"/>
+        </w:rPr>
+        <w:t>GitHub không cho dùng mật khẩu đăng nhập thông thường khi push mã nguồn qua HTTPS. Bạn cần dùng Token:</w:t>
+        <w:br/>
+        <w:t>1. Vào GitHub -&gt; Bấm ảnh đại diện góc trên phải -&gt; Settings -&gt; Developer settings (dưới cùng bên trái).</w:t>
+        <w:br/>
+        <w:t>2. Chọn Personal access tokens -&gt; Tokens (classic) -&gt; Generate new token (classic).</w:t>
+        <w:br/>
+        <w:t>3. Note: Điền tên máy tính (ví dụ: Laptop-Dell). Expiration: Chọn No expiration.</w:t>
+        <w:br/>
+        <w:t>4. Tích chọn ô vuông 'repo' (toàn quyền mã nguồn) -&gt; Bấm Generate token.</w:t>
+        <w:br/>
+        <w:t>5. Copy chuỗi token (dạng ghp_...) và lưu lại. Khi Terminal hỏi Password, dán Token này vào là xong!</w:t>
+      </w:r>
+    </w:p>
+    <w:p>
+      <w:pPr>
+        <w:spacing w:before="120"/>
+      </w:pPr>
+      <w:r>
+        <w:rPr>
+          <w:b/>
+          <w:color w:val="1E3A8A"/>
+          <w:sz w:val="22"/>
+        </w:rPr>
+        <w:t>Bước 2.4: Dùng Công Cụ Trực Quan GitHub Desktop (Không Cần Gõ Lệnh)</w:t>
+        <w:br/>
+      </w:r>
+      <w:r>
+        <w:rPr>
+          <w:sz w:val="20"/>
+        </w:rPr>
+        <w:t>Tải ứng dụng miễn phí tại https://desktop.github.com/ -&gt; Đăng nhập tài khoản GitHub -&gt; Kéo thả thư mục dự án vào -&gt; Bấm 'Commit to main' -&gt; Bấm 'Push origin'. Tất cả thao tác chỉ bằng chuột!</w:t>
+      </w:r>
+    </w:p>
+    <w:p/>
+    <w:p>
+      <w:pPr>
+        <w:spacing w:before="280" w:after="80"/>
+      </w:pPr>
+      <w:r>
+        <w:rPr>
+          <w:rFonts w:ascii="Segoe UI" w:hAnsi="Segoe UI"/>
+          <w:b/>
+          <w:color w:val="B45309"/>
+          <w:sz w:val="26"/>
+        </w:rPr>
+        <w:t>4. PHẦN 3: HƯỚNG DẪN TRIỂN KHAI ỨNG DỤNG LÊN VERCEL</w:t>
+      </w:r>
+    </w:p>
+    <w:p>
+      <w:r>
+        <w:rPr>
+          <w:b/>
+          <w:color w:val="B45309"/>
+          <w:sz w:val="21"/>
+        </w:rPr>
+        <w:t>LỰA CHỌN PHƯƠNG THỨC TRIỂN KHAI:</w:t>
+        <w:br/>
+      </w:r>
+      <w:r>
+        <w:rPr>
+          <w:sz w:val="20"/>
+        </w:rPr>
+        <w:t>Bạn có thể chọn 1 trong 2 cách sau để triển khai ứng dụng lên máy chủ đám mây Vercel:</w:t>
+        <w:br/>
+        <w:t>• CÁCH 1 (Khuyên dùng - Nhanh nhất): Triển khai trực tiếp từ máy tính bằng Vercel CLI — KHÔNG CẦN QUA GIT/GITHUB.</w:t>
+        <w:br/>
+        <w:t>• CÁCH 2: Kết nối tự động qua GitHub Repository (Tự động build lại mỗi khi đẩy code).</w:t>
+      </w:r>
+    </w:p>
+    <w:p>
+      <w:pPr>
+        <w:spacing w:before="160"/>
+      </w:pPr>
+      <w:r>
+        <w:rPr>
+          <w:b/>
+          <w:color w:val="1E3A8A"/>
+          <w:sz w:val="22"/>
+        </w:rPr>
+        <w:t>🚀 CÁCH 1: TRIỂN KHAI TRỰC TIẾP LÊN VERCEL (KHÔNG CẦN DÙNG GIT)</w:t>
+        <w:br/>
+      </w:r>
+    </w:p>
+    <w:tbl>
+      <w:tblPr>
+        <w:tblW w:type="auto" w:w="0"/>
+        <w:jc w:val="center"/>
+        <w:tblLayout w:type="fixed"/>
+        <w:tblLook w:firstColumn="1" w:firstRow="1" w:lastColumn="0" w:lastRow="0" w:noHBand="0" w:noVBand="1" w:val="04A0"/>
+      </w:tblPr>
+      <w:tblGrid>
+        <w:gridCol w:w="9648"/>
+      </w:tblGrid>
+      <w:tr>
+        <w:tc>
+          <w:tcPr>
+            <w:tcW w:type="dxa" w:w="9360"/>
+            <w:shd w:fill="FFF8E7"/>
+            <w:tcMar>
+              <w:top w:w="140" w:type="dxa"/>
+              <w:bottom w:w="140" w:type="dxa"/>
+              <w:left w:w="200" w:type="dxa"/>
+              <w:right w:w="200" w:type="dxa"/>
+            </w:tcMar>
+            <w:tcBorders>
+              <w:top w:val="none"/>
+              <w:left w:val="single" w:sz="36" w:space="0" w:color="D97706"/>
+              <w:bottom w:val="none"/>
+              <w:right w:val="none"/>
+            </w:tcBorders>
+          </w:tcPr>
+          <w:p>
+            <w:pPr>
+              <w:spacing w:before="40" w:after="80"/>
+            </w:pPr>
+            <w:r>
+              <w:rPr>
+                <w:rFonts w:ascii="Segoe UI" w:hAnsi="Segoe UI"/>
+                <w:b/>
+                <w:color w:val="D97706"/>
+                <w:sz w:val="21"/>
+              </w:rPr>
+              <w:t xml:space="preserve">📌 ĐIỂM NỔI BẬT: </w:t>
+            </w:r>
+            <w:r>
+              <w:rPr>
+                <w:rFonts w:ascii="Segoe UI" w:hAnsi="Segoe UI"/>
+                <w:color w:val="323232"/>
+                <w:sz w:val="20"/>
+              </w:rPr>
+              <w:t>Ưu điểm lớn nhất của cách này: Bạn KHÔNG CẦN tài khoản GitHub, không cần tạo repo, không cần gõ lệnh git commit hay push. Toàn bộ mã nguồn trên máy tính sẽ được Vercel CLI đóng gói và tải thẳng lên đám mây Vercel!</w:t>
+            </w:r>
+          </w:p>
+        </w:tc>
+      </w:tr>
+    </w:tbl>
+    <w:p/>
+    <w:p>
+      <w:pPr>
+        <w:spacing w:before="120"/>
+      </w:pPr>
+      <w:r>
+        <w:rPr>
+          <w:b/>
+          <w:color w:val="1E3A8A"/>
+          <w:sz w:val="21"/>
+        </w:rPr>
+        <w:t>Bước 3.1A: Đăng nhập Vercel CLI trên máy tính</w:t>
+        <w:br/>
+      </w:r>
+      <w:r>
+        <w:rPr>
+          <w:sz w:val="20"/>
+        </w:rPr>
+        <w:t>1. Mở PowerShell / Command Prompt tại thư mục dự án bakery-erp.</w:t>
+        <w:br/>
+        <w:t>2. Chạy lệnh: npx vercel login</w:t>
+        <w:br/>
+        <w:t>3. Dùng phím mũi tên chọn 'Continue with Email' (hoặc GitHub/Google) -&gt; Nhập Email -&gt; Bấm Enter.</w:t>
+        <w:br/>
+        <w:t>4. Mở hòm thư Email, bấm nút 'Verify' để xác nhận. Màn hình Terminal sẽ báo 'Success! Email confirmed'.</w:t>
+      </w:r>
+    </w:p>
+    <w:p>
+      <w:pPr>
+        <w:spacing w:before="120"/>
+      </w:pPr>
+      <w:r>
+        <w:rPr>
+          <w:b/>
+          <w:color w:val="1E3A8A"/>
+          <w:sz w:val="21"/>
+        </w:rPr>
+        <w:t>Bước 3.1B: Chạy lệnh đẩy dự án lên Vercel</w:t>
+        <w:br/>
+      </w:r>
+      <w:r>
+        <w:rPr>
+          <w:sz w:val="20"/>
+        </w:rPr>
+        <w:t>Tại thư mục dự án, chạy lệnh: npx vercel</w:t>
+        <w:br/>
+        <w:t>Hệ thống sẽ hỏi 5 câu cấu hình ban đầu (chỉ hỏi 1 lần đầu tiên):</w:t>
+        <w:br/>
+        <w:t xml:space="preserve">  1. Set up and deploy? -&gt; Gõ Y rồi Enter.</w:t>
+        <w:br/>
+        <w:t xml:space="preserve">  2. Which scope? -&gt; Bấm Enter (chọn tài khoản của bạn).</w:t>
+        <w:br/>
+        <w:t xml:space="preserve">  3. Link to existing project? -&gt; Gõ N (nếu là dự án mới) rồi Enter.</w:t>
+        <w:br/>
+        <w:t xml:space="preserve">  4. What's your project's name? -&gt; Nhập tên bakery-pos rồi Enter.</w:t>
+        <w:br/>
+        <w:t xml:space="preserve">  5. In which directory is your code located? -&gt; Bấm Enter (để nguyên ./).</w:t>
+        <w:br/>
+        <w:t xml:space="preserve">  6. Want to modify these settings? -&gt; Gõ N rồi Enter.</w:t>
+        <w:br/>
+        <w:t>Vercel sẽ tự động nén mã nguồn, tải lên máy chủ và cấp cho bạn 1 đường link Preview chạy thử ngay lập tức!</w:t>
+      </w:r>
+    </w:p>
+    <w:p>
+      <w:pPr>
+        <w:spacing w:before="120"/>
+      </w:pPr>
+      <w:r>
+        <w:rPr>
+          <w:b/>
+          <w:color w:val="1E3A8A"/>
+          <w:sz w:val="21"/>
+        </w:rPr>
+        <w:t>Bước 3.1C: Xuất bản chính thức (Production Deploy)</w:t>
+        <w:br/>
+      </w:r>
+      <w:r>
+        <w:rPr>
+          <w:sz w:val="20"/>
+        </w:rPr>
+        <w:t>Khi muốn cập nhật bản chính thức ổn định lên môi trường Production, chỉ cần chạy đúng 1 lệnh:</w:t>
+        <w:br/>
+        <w:br/>
+        <w:t xml:space="preserve">   npx vercel --prod</w:t>
+        <w:br/>
+        <w:br/>
+        <w:t>Mỗi lần bạn sửa đổi code trên máy tính, chỉ cần gõ đúng 1 dòng lệnh trên là website tự động cập nhật ngay lập tức mà không cần đụng đến Git!</w:t>
+      </w:r>
+    </w:p>
+    <w:p>
+      <w:pPr>
+        <w:spacing w:before="200"/>
+      </w:pPr>
+      <w:r>
+        <w:rPr>
+          <w:b/>
+          <w:color w:val="1E3A8A"/>
+          <w:sz w:val="22"/>
+        </w:rPr>
+        <w:t>🌐 CÁCH 2: IMPORT QUA GITHUB (TỰ ĐỘNG ĐỒNG BỘ CI/CD)</w:t>
+        <w:br/>
+      </w:r>
+      <w:r>
+        <w:rPr>
+          <w:sz w:val="20"/>
+        </w:rPr>
+        <w:t>Nếu bạn muốn liên kết dự án với GitHub để mỗi khi chạy 'git push' Vercel tự động build lại:</w:t>
+        <w:br/>
+        <w:t>1. Truy cập https://vercel.com và đăng nhập bằng tài khoản GitHub.</w:t>
+        <w:br/>
+        <w:t>2. Bấm nút 'Add New...' (góc phải trên) -&gt; chọn 'Project'.</w:t>
+        <w:br/>
+        <w:t>3. Tại danh sách repositories hiện ra, tìm 'bakery-pos' -&gt; bấm nút 'Import'.</w:t>
       </w:r>
     </w:p>
     <w:p>
@@ -605,7 +987,7 @@
           <w:color w:val="1E3A8A"/>
           <w:sz w:val="22"/>
         </w:rPr>
-        <w:t>Bước 2.3: Thiết Lập Biến Môi Trường (Environment Variables)</w:t>
+        <w:t>Bước 3.2: Thiết Lập Biến Môi Trường (Environment Variables)</w:t>
         <w:br/>
       </w:r>
       <w:r>
@@ -1505,7 +1887,7 @@
           <w:color w:val="1E3A8A"/>
           <w:sz w:val="22"/>
         </w:rPr>
-        <w:t>Bước 2.4: Tiến Hành Triển Khai (Deploy)</w:t>
+        <w:t>Bước 3.3: Tiến Hành Triển Khai (Deploy)</w:t>
         <w:br/>
       </w:r>
       <w:r>
@@ -1533,7 +1915,7 @@
           <w:color w:val="B45309"/>
           <w:sz w:val="26"/>
         </w:rPr>
-        <w:t>4. PHẦN 3: DANH SÁCH TÀI KHOẢN MẶC ĐỊNH &amp; NGHIỆM THU</w:t>
+        <w:t>5. PHẦN 4: DANH SÁCH TÀI KHOẢN MẶC ĐỊNH &amp; NGHIỆM THU</w:t>
       </w:r>
     </w:p>
     <w:p>
@@ -2518,7 +2900,7 @@
           <w:color w:val="B45309"/>
           <w:sz w:val="26"/>
         </w:rPr>
-        <w:t>5. PHẦN 4: HƯỚNG DẪN VẬN HÀNH, SAO LƯU &amp; XỬ LÝ SỰ CỐ</w:t>
+        <w:t>6. PHẦN 5: HƯỚNG DẪN VẬN HÀNH, SAO LƯU &amp; XỬ LÝ SỰ CỐ</w:t>
       </w:r>
     </w:p>
     <w:p>

</xml_diff>

<commit_message>
feat(rescue): implement standalone Admin Rescue Desktop App and zero-dependency 1-time OTP recovery mechanism across Cloud and Local SQL
</commit_message>
<xml_diff>
--- a/HUONG_DAN_CAI_DAT_VA_TRIEN_KHAI_BAKERY_ERP.docx
+++ b/HUONG_DAN_CAI_DAT_VA_TRIEN_KHAI_BAKERY_ERP.docx
@@ -2950,6 +2950,34 @@
     </w:p>
     <w:p>
       <w:pPr>
+        <w:spacing w:before="160"/>
+      </w:pPr>
+      <w:r>
+        <w:rPr>
+          <w:b/>
+          <w:color w:val="B45309"/>
+          <w:sz w:val="21"/>
+        </w:rPr>
+        <w:t>5.3. Ứng Dụng Cứu Hộ Admin: Tạo Mã Đăng Nhập 1 Lần &amp; Đổi Mật Khẩu</w:t>
+        <w:br/>
+      </w:r>
+      <w:r>
+        <w:rPr>
+          <w:sz w:val="19"/>
+        </w:rPr>
+        <w:t>Hệ thống đã tích hợp sẵn ứng dụng cứu hộ độc lập trên máy tính, không phụ thuộc vào tình trạng mạng hay CSDL:</w:t>
+        <w:br/>
+        <w:t>1. Cách mở ứng dụng: Vào thư mục dự án bakery-erp trên máy tính -&gt; Nhấp đúp chuột vào file: 'Tao_Ma_Admin_1_Lan.bat'.</w:t>
+        <w:br/>
+        <w:t>2. Cửa sổ đồ họa sẽ xuất hiện, tự động tạo Mã Đăng Nhập 1 Lần (dạng ADM-XXXXXX) và tự sao chép vào bộ nhớ tạm (Clipboard).</w:t>
+        <w:br/>
+        <w:t>3. Cách sử dụng trên web: Mở màn hình Đăng Nhập trên website -&gt; Bấm 'Quên mật khẩu?' -&gt; Dán mã vừa tạo -&gt; Nhập mật khẩu Admin mới -&gt; Bấm 'Đặt Lại Mật Khẩu Admin &amp; Vào Hệ Thống'.</w:t>
+        <w:br/>
+        <w:t>4. Tính bảo mật tuyệt đối: Mỗi mã chỉ có hiệu lực trong 15 phút và tự hủy vĩnh viễn ngay sau 1 lần sử dụng.</w:t>
+      </w:r>
+    </w:p>
+    <w:p>
+      <w:pPr>
         <w:spacing w:before="160" w:after="80"/>
       </w:pPr>
       <w:r>
@@ -2958,7 +2986,7 @@
           <w:color w:val="1E3A8A"/>
           <w:sz w:val="21"/>
         </w:rPr>
-        <w:t>5.3. Bảng Xử Lý Sự Cố Nhanh (Troubleshooting)</w:t>
+        <w:t>5.4. Bảng Xử Lý Sự Cố Nhanh (Troubleshooting)</w:t>
         <w:br/>
       </w:r>
     </w:p>
@@ -3411,7 +3439,7 @@
                 <w:color w:val="1E1E1E"/>
                 <w:sz w:val="19"/>
               </w:rPr>
-              <w:t>Nhập mã khôi phục tối cao BAKERY-RESCUE-2026 tại form đăng nhập để đặt lại mật khẩu.</w:t>
+              <w:t>Nhấp đúp file Tao_Ma_Admin_1_Lan.bat để lấy mã 1 lần hoặc dùng mã BAKERY-RESCUE-2026.</w:t>
             </w:r>
           </w:p>
         </w:tc>

</xml_diff>